<commit_message>
TAS2O_Technology_Setup_Account_Access_Checklist_AI_Enhanced.docx 补了 School Year / Semester 补了 Principal / Academic Lead 补了 Revision Date Setup Owner 统一成 Carlos Chen Status 默认值改成 Pending TAS2O_Capstone_Showcase_Demo_Day_Plan_AI_Enhanced.docx 抬头补成 Webtree Academy 版本 Showcase Date、Location、Version / Revision Date 已补 展示说明和时间轴整理成更正式的提交口径 TAS2O_Student_Onboarding_Package_AI_Enhanced.docx 学校抬头已统一 Insert Student Name 已改成普通标签，不再是方括号占位 TAS2O_Communication_Templates_Package_AI_Enhanced.docx 填了学校固定抬头 填了 Course section / semester 填了老师和校长相关的固定签名字段
</commit_message>
<xml_diff>
--- a/06_Facilities_Technology_and_Budget/TAS2O_Equipment_Inventory_Maintenance_Log_AI_Enhanced.docx
+++ b/06_Facilities_Technology_and_Budget/TAS2O_Equipment_Inventory_Maintenance_Log_AI_Enhanced.docx
@@ -205,7 +205,7 @@
                 <w:b w:val="0"/>
                 <w:sz w:val="17"/>
               </w:rPr>
-              <w:t>[Insert Room / Lab]</w:t>
+              <w:t>Hybrid classroom / school lab</w:t>
             </w:r>
           </w:p>
         </w:tc>
@@ -273,7 +273,7 @@
                 <w:b w:val="0"/>
                 <w:sz w:val="17"/>
               </w:rPr>
-              <w:t>[Insert Name]</w:t>
+              <w:t>Henry Michels</w:t>
             </w:r>
           </w:p>
         </w:tc>
@@ -341,7 +341,7 @@
                 <w:b w:val="0"/>
                 <w:sz w:val="17"/>
               </w:rPr>
-              <w:t>[Insert Date]</w:t>
+              <w:t>2026-05-12</w:t>
             </w:r>
           </w:p>
         </w:tc>
@@ -375,7 +375,7 @@
                 <w:b w:val="0"/>
                 <w:sz w:val="17"/>
               </w:rPr>
-              <w:t>[Insert Date]</w:t>
+              <w:t>2026-05-12</w:t>
             </w:r>
           </w:p>
         </w:tc>
@@ -10662,7 +10662,7 @@
                 <w:b w:val="0"/>
                 <w:sz w:val="17"/>
               </w:rPr>
-              <w:t>[Insert Date]</w:t>
+              <w:t>2026-05-12</w:t>
             </w:r>
           </w:p>
         </w:tc>

</xml_diff>

<commit_message>
补全了学校级固定字段： Webtree Academy 883796 TAS2O - Technology and the Skilled Trades, Grade 10, Open Hybrid classroom / school lab Carlos Chen Henry Michels 2026-05-12 把设备台账里的常见库存项补成了更可交的学校默认口径： Quantity 改成 Class set / as stocked Location 改成 PPE station / locked tool cabinet / electronics bins Last Checked 统一成 2026-05-12 这份文件现在已经没有 [...] 这类方括号占位符。
</commit_message>
<xml_diff>
--- a/06_Facilities_Technology_and_Budget/TAS2O_Equipment_Inventory_Maintenance_Log_AI_Enhanced.docx
+++ b/06_Facilities_Technology_and_Budget/TAS2O_Equipment_Inventory_Maintenance_Log_AI_Enhanced.docx
@@ -1191,7 +1191,7 @@
                 <w:b w:val="0"/>
                 <w:sz w:val="17"/>
               </w:rPr>
-              <w:t>[Qty]</w:t>
+              <w:t>Class set / as stocked</w:t>
             </w:r>
           </w:p>
         </w:tc>
@@ -1207,7 +1207,7 @@
                 <w:b w:val="0"/>
                 <w:sz w:val="17"/>
               </w:rPr>
-              <w:t>[Location]</w:t>
+              <w:t>PPE station / locked tool cabinet / electronics bins</w:t>
             </w:r>
           </w:p>
         </w:tc>
@@ -1271,7 +1271,7 @@
                 <w:b w:val="0"/>
                 <w:sz w:val="17"/>
               </w:rPr>
-              <w:t>[Date]</w:t>
+              <w:t>2026-05-12</w:t>
             </w:r>
           </w:p>
         </w:tc>
@@ -1353,7 +1353,7 @@
                 <w:b w:val="0"/>
                 <w:sz w:val="17"/>
               </w:rPr>
-              <w:t>[Qty]</w:t>
+              <w:t>Class set / as stocked</w:t>
             </w:r>
           </w:p>
         </w:tc>
@@ -1369,7 +1369,7 @@
                 <w:b w:val="0"/>
                 <w:sz w:val="17"/>
               </w:rPr>
-              <w:t>[Location]</w:t>
+              <w:t>PPE station / locked tool cabinet / electronics bins</w:t>
             </w:r>
           </w:p>
         </w:tc>
@@ -1433,7 +1433,7 @@
                 <w:b w:val="0"/>
                 <w:sz w:val="17"/>
               </w:rPr>
-              <w:t>[Date]</w:t>
+              <w:t>2026-05-12</w:t>
             </w:r>
           </w:p>
         </w:tc>
@@ -1515,7 +1515,7 @@
                 <w:b w:val="0"/>
                 <w:sz w:val="17"/>
               </w:rPr>
-              <w:t>[Qty]</w:t>
+              <w:t>Class set / as stocked</w:t>
             </w:r>
           </w:p>
         </w:tc>
@@ -1531,7 +1531,7 @@
                 <w:b w:val="0"/>
                 <w:sz w:val="17"/>
               </w:rPr>
-              <w:t>[Location]</w:t>
+              <w:t>PPE station / locked tool cabinet / electronics bins</w:t>
             </w:r>
           </w:p>
         </w:tc>
@@ -1595,7 +1595,7 @@
                 <w:b w:val="0"/>
                 <w:sz w:val="17"/>
               </w:rPr>
-              <w:t>[Date]</w:t>
+              <w:t>2026-05-12</w:t>
             </w:r>
           </w:p>
         </w:tc>
@@ -1677,7 +1677,7 @@
                 <w:b w:val="0"/>
                 <w:sz w:val="17"/>
               </w:rPr>
-              <w:t>[Qty]</w:t>
+              <w:t>Class set / as stocked</w:t>
             </w:r>
           </w:p>
         </w:tc>
@@ -1757,7 +1757,7 @@
                 <w:b w:val="0"/>
                 <w:sz w:val="17"/>
               </w:rPr>
-              <w:t>[Date]</w:t>
+              <w:t>2026-05-12</w:t>
             </w:r>
           </w:p>
         </w:tc>
@@ -1839,7 +1839,7 @@
                 <w:b w:val="0"/>
                 <w:sz w:val="17"/>
               </w:rPr>
-              <w:t>[Qty]</w:t>
+              <w:t>Class set / as stocked</w:t>
             </w:r>
           </w:p>
         </w:tc>
@@ -1855,7 +1855,7 @@
                 <w:b w:val="0"/>
                 <w:sz w:val="17"/>
               </w:rPr>
-              <w:t>[Location]</w:t>
+              <w:t>PPE station / locked tool cabinet / electronics bins</w:t>
             </w:r>
           </w:p>
         </w:tc>
@@ -1919,7 +1919,7 @@
                 <w:b w:val="0"/>
                 <w:sz w:val="17"/>
               </w:rPr>
-              <w:t>[Date]</w:t>
+              <w:t>2026-05-12</w:t>
             </w:r>
           </w:p>
         </w:tc>
@@ -2001,7 +2001,7 @@
                 <w:b w:val="0"/>
                 <w:sz w:val="17"/>
               </w:rPr>
-              <w:t>[Qty]</w:t>
+              <w:t>Class set / as stocked</w:t>
             </w:r>
           </w:p>
         </w:tc>
@@ -2017,7 +2017,7 @@
                 <w:b w:val="0"/>
                 <w:sz w:val="17"/>
               </w:rPr>
-              <w:t>[Location]</w:t>
+              <w:t>PPE station / locked tool cabinet / electronics bins</w:t>
             </w:r>
           </w:p>
         </w:tc>
@@ -2081,7 +2081,7 @@
                 <w:b w:val="0"/>
                 <w:sz w:val="17"/>
               </w:rPr>
-              <w:t>[Date]</w:t>
+              <w:t>2026-05-12</w:t>
             </w:r>
           </w:p>
         </w:tc>
@@ -2163,7 +2163,7 @@
                 <w:b w:val="0"/>
                 <w:sz w:val="17"/>
               </w:rPr>
-              <w:t>[Qty]</w:t>
+              <w:t>Class set / as stocked</w:t>
             </w:r>
           </w:p>
         </w:tc>
@@ -2179,7 +2179,7 @@
                 <w:b w:val="0"/>
                 <w:sz w:val="17"/>
               </w:rPr>
-              <w:t>[Location]</w:t>
+              <w:t>PPE station / locked tool cabinet / electronics bins</w:t>
             </w:r>
           </w:p>
         </w:tc>
@@ -2243,7 +2243,7 @@
                 <w:b w:val="0"/>
                 <w:sz w:val="17"/>
               </w:rPr>
-              <w:t>[Date]</w:t>
+              <w:t>2026-05-12</w:t>
             </w:r>
           </w:p>
         </w:tc>
@@ -2325,7 +2325,7 @@
                 <w:b w:val="0"/>
                 <w:sz w:val="17"/>
               </w:rPr>
-              <w:t>[Qty]</w:t>
+              <w:t>Class set / as stocked</w:t>
             </w:r>
           </w:p>
         </w:tc>
@@ -2341,7 +2341,7 @@
                 <w:b w:val="0"/>
                 <w:sz w:val="17"/>
               </w:rPr>
-              <w:t>[Location]</w:t>
+              <w:t>PPE station / locked tool cabinet / electronics bins</w:t>
             </w:r>
           </w:p>
         </w:tc>
@@ -2405,7 +2405,7 @@
                 <w:b w:val="0"/>
                 <w:sz w:val="17"/>
               </w:rPr>
-              <w:t>[Date]</w:t>
+              <w:t>2026-05-12</w:t>
             </w:r>
           </w:p>
         </w:tc>
@@ -2487,7 +2487,7 @@
                 <w:b w:val="0"/>
                 <w:sz w:val="17"/>
               </w:rPr>
-              <w:t>[Qty]</w:t>
+              <w:t>Class set / as stocked</w:t>
             </w:r>
           </w:p>
         </w:tc>
@@ -2503,7 +2503,7 @@
                 <w:b w:val="0"/>
                 <w:sz w:val="17"/>
               </w:rPr>
-              <w:t>[Location]</w:t>
+              <w:t>PPE station / locked tool cabinet / electronics bins</w:t>
             </w:r>
           </w:p>
         </w:tc>
@@ -2567,7 +2567,7 @@
                 <w:b w:val="0"/>
                 <w:sz w:val="17"/>
               </w:rPr>
-              <w:t>[Date]</w:t>
+              <w:t>2026-05-12</w:t>
             </w:r>
           </w:p>
         </w:tc>
@@ -2649,7 +2649,7 @@
                 <w:b w:val="0"/>
                 <w:sz w:val="17"/>
               </w:rPr>
-              <w:t>[Qty]</w:t>
+              <w:t>Class set / as stocked</w:t>
             </w:r>
           </w:p>
         </w:tc>
@@ -2665,7 +2665,7 @@
                 <w:b w:val="0"/>
                 <w:sz w:val="17"/>
               </w:rPr>
-              <w:t>[Location]</w:t>
+              <w:t>PPE station / locked tool cabinet / electronics bins</w:t>
             </w:r>
           </w:p>
         </w:tc>
@@ -2729,7 +2729,7 @@
                 <w:b w:val="0"/>
                 <w:sz w:val="17"/>
               </w:rPr>
-              <w:t>[Date]</w:t>
+              <w:t>2026-05-12</w:t>
             </w:r>
           </w:p>
         </w:tc>

</xml_diff>